<commit_message>
finished uploading all of the correct footprints and 3D bodies. this is now done, and barely different than what was fabricated - used all manufacturers FPs (instead of kicads), but this didn't cause any of the original connections to break. I will now start on V02 (incl FPGA and smaller)
</commit_message>
<xml_diff>
--- a/PIM_V01/PIM_V01_BRINGUP.docx
+++ b/PIM_V01/PIM_V01_BRINGUP.docx
@@ -16446,11 +16446,15 @@
     <w:p>
       <w:pPr>
         <w:rPr>
-          <w:lang w:eastAsia="en-NZ"/>
-        </w:rPr>
-      </w:pPr>
-      <w:r>
-        <w:rPr>
+          <w:b/>
+          <w:bCs/>
+          <w:lang w:eastAsia="en-NZ"/>
+        </w:rPr>
+      </w:pPr>
+      <w:r>
+        <w:rPr>
+          <w:b/>
+          <w:bCs/>
           <w:lang w:eastAsia="en-NZ"/>
         </w:rPr>
         <w:t>29-AUG-26. Kala Payinda. RL soldering labs</w:t>
@@ -16679,7 +16683,13 @@
               <w:rPr>
                 <w:lang w:eastAsia="en-NZ"/>
               </w:rPr>
-              <w:t xml:space="preserve">Don’t have D4 – left </w:t>
+              <w:t xml:space="preserve">D4 </w:t>
+            </w:r>
+            <w:r>
+              <w:rPr>
+                <w:lang w:eastAsia="en-NZ"/>
+              </w:rPr>
+              <w:t>absent (</w:t>
             </w:r>
             <w:proofErr w:type="spellStart"/>
             <w:r>
@@ -16693,7 +16703,7 @@
               <w:rPr>
                 <w:lang w:eastAsia="en-NZ"/>
               </w:rPr>
-              <w:t>. Not blocking.</w:t>
+              <w:t>), not blocking.</w:t>
             </w:r>
           </w:p>
         </w:tc>
@@ -16767,7 +16777,13 @@
               <w:rPr>
                 <w:lang w:eastAsia="en-NZ"/>
               </w:rPr>
-              <w:t xml:space="preserve">Don’t have U1 – left </w:t>
+              <w:t xml:space="preserve">U1 </w:t>
+            </w:r>
+            <w:r>
+              <w:rPr>
+                <w:lang w:eastAsia="en-NZ"/>
+              </w:rPr>
+              <w:t>absent (</w:t>
             </w:r>
             <w:proofErr w:type="spellStart"/>
             <w:r>
@@ -16781,21 +16797,14 @@
               <w:rPr>
                 <w:lang w:eastAsia="en-NZ"/>
               </w:rPr>
-              <w:t xml:space="preserve">. Bloking. </w:t>
-            </w:r>
-            <w:proofErr w:type="gramStart"/>
-            <w:r>
-              <w:rPr>
-                <w:lang w:eastAsia="en-NZ"/>
-              </w:rPr>
-              <w:t>Cant</w:t>
-            </w:r>
-            <w:proofErr w:type="gramEnd"/>
-            <w:r>
-              <w:rPr>
-                <w:lang w:eastAsia="en-NZ"/>
-              </w:rPr>
-              <w:t xml:space="preserve"> test _PL.</w:t>
+              <w:t xml:space="preserve">), </w:t>
+            </w:r>
+            <w:r>
+              <w:rPr>
+                <w:highlight w:val="yellow"/>
+                <w:lang w:eastAsia="en-NZ"/>
+              </w:rPr>
+              <w:t>BLOCKING. Can’t test _PL.</w:t>
             </w:r>
           </w:p>
         </w:tc>
@@ -16869,13 +16878,25 @@
               <w:rPr>
                 <w:lang w:eastAsia="en-NZ"/>
               </w:rPr>
-              <w:t>C38 -&gt; 33nF instead. No 52.3kR</w:t>
-            </w:r>
-            <w:r>
-              <w:rPr>
-                <w:lang w:eastAsia="en-NZ"/>
-              </w:rPr>
-              <w:t xml:space="preserve"> (</w:t>
+              <w:t>C38 -&gt; 33nF instead. 52.3kR</w:t>
+            </w:r>
+            <w:r>
+              <w:rPr>
+                <w:lang w:eastAsia="en-NZ"/>
+              </w:rPr>
+              <w:t xml:space="preserve"> </w:t>
+            </w:r>
+            <w:r>
+              <w:rPr>
+                <w:lang w:eastAsia="en-NZ"/>
+              </w:rPr>
+              <w:t xml:space="preserve">absent </w:t>
+            </w:r>
+            <w:r>
+              <w:rPr>
+                <w:lang w:eastAsia="en-NZ"/>
+              </w:rPr>
+              <w:t>(</w:t>
             </w:r>
             <w:r>
               <w:rPr>
@@ -16899,7 +16920,19 @@
               <w:rPr>
                 <w:lang w:eastAsia="en-NZ"/>
               </w:rPr>
-              <w:t xml:space="preserve"> No 4.99kR (replaced w 5.1kR). </w:t>
+              <w:t xml:space="preserve"> 4.99kR </w:t>
+            </w:r>
+            <w:r>
+              <w:rPr>
+                <w:lang w:eastAsia="en-NZ"/>
+              </w:rPr>
+              <w:t xml:space="preserve">absent </w:t>
+            </w:r>
+            <w:r>
+              <w:rPr>
+                <w:lang w:eastAsia="en-NZ"/>
+              </w:rPr>
+              <w:t xml:space="preserve">(replaced w 5.1kR). </w:t>
             </w:r>
           </w:p>
           <w:p>
@@ -17036,7 +17069,19 @@
               <w:rPr>
                 <w:lang w:eastAsia="en-NZ"/>
               </w:rPr>
-              <w:t>U2 is missing (</w:t>
+              <w:t xml:space="preserve">U2 </w:t>
+            </w:r>
+            <w:r>
+              <w:rPr>
+                <w:lang w:eastAsia="en-NZ"/>
+              </w:rPr>
+              <w:t>absent</w:t>
+            </w:r>
+            <w:r>
+              <w:rPr>
+                <w:lang w:eastAsia="en-NZ"/>
+              </w:rPr>
+              <w:t xml:space="preserve"> (</w:t>
             </w:r>
             <w:proofErr w:type="spellStart"/>
             <w:r>
@@ -17056,7 +17101,13 @@
               <w:rPr>
                 <w:lang w:eastAsia="en-NZ"/>
               </w:rPr>
-              <w:t xml:space="preserve">Q2 Q3 missing. </w:t>
+              <w:t xml:space="preserve">Q2 Q3 </w:t>
+            </w:r>
+            <w:r>
+              <w:rPr>
+                <w:lang w:eastAsia="en-NZ"/>
+              </w:rPr>
+              <w:t>absent.</w:t>
             </w:r>
           </w:p>
         </w:tc>
@@ -17196,6 +17247,234 @@
         </w:drawing>
       </w:r>
     </w:p>
+    <w:p>
+      <w:pPr>
+        <w:jc w:val="center"/>
+        <w:rPr>
+          <w:lang w:eastAsia="en-NZ"/>
+        </w:rPr>
+      </w:pPr>
+    </w:p>
+    <w:p>
+      <w:pPr>
+        <w:jc w:val="center"/>
+        <w:rPr>
+          <w:lang w:eastAsia="en-NZ"/>
+        </w:rPr>
+      </w:pPr>
+    </w:p>
+    <w:p>
+      <w:pPr>
+        <w:rPr>
+          <w:b/>
+          <w:bCs/>
+          <w:lang w:eastAsia="en-NZ"/>
+        </w:rPr>
+      </w:pPr>
+      <w:r>
+        <w:rPr>
+          <w:b/>
+          <w:bCs/>
+          <w:lang w:eastAsia="en-NZ"/>
+        </w:rPr>
+        <w:lastRenderedPageBreak/>
+        <w:t>08-SEP-26. Kala Payinda. Uni</w:t>
+      </w:r>
+    </w:p>
+    <w:p>
+      <w:pPr>
+        <w:rPr>
+          <w:lang w:eastAsia="en-NZ"/>
+        </w:rPr>
+      </w:pPr>
+      <w:r>
+        <w:rPr>
+          <w:lang w:eastAsia="en-NZ"/>
+        </w:rPr>
+        <w:t>New plan from components not being present for the next week.</w:t>
+      </w:r>
+    </w:p>
+    <w:p>
+      <w:pPr>
+        <w:pStyle w:val="ListParagraph"/>
+        <w:numPr>
+          <w:ilvl w:val="0"/>
+          <w:numId w:val="7"/>
+        </w:numPr>
+        <w:rPr>
+          <w:lang w:eastAsia="en-NZ"/>
+        </w:rPr>
+      </w:pPr>
+      <w:r>
+        <w:rPr>
+          <w:lang w:eastAsia="en-NZ"/>
+        </w:rPr>
+        <w:t>Test USB-C</w:t>
+      </w:r>
+      <w:r>
+        <w:rPr>
+          <w:lang w:eastAsia="en-NZ"/>
+        </w:rPr>
+        <w:t xml:space="preserve">. Ben provided a USB adaptor that allows a PSU to control power into a USB cable. I will input 5V with hard current </w:t>
+      </w:r>
+      <w:proofErr w:type="gramStart"/>
+      <w:r>
+        <w:rPr>
+          <w:lang w:eastAsia="en-NZ"/>
+        </w:rPr>
+        <w:t>limit, and</w:t>
+      </w:r>
+      <w:proofErr w:type="gramEnd"/>
+      <w:r>
+        <w:rPr>
+          <w:lang w:eastAsia="en-NZ"/>
+        </w:rPr>
+        <w:t xml:space="preserve"> connect it to my PCB now. The LED should come on and the 3V3 LDO should regulate correctly. If this works, then the MCU can be flashed. </w:t>
+      </w:r>
+    </w:p>
+    <w:p>
+      <w:pPr>
+        <w:pStyle w:val="ListParagraph"/>
+        <w:numPr>
+          <w:ilvl w:val="0"/>
+          <w:numId w:val="7"/>
+        </w:numPr>
+        <w:rPr>
+          <w:lang w:eastAsia="en-NZ"/>
+        </w:rPr>
+      </w:pPr>
+      <w:r>
+        <w:rPr>
+          <w:lang w:eastAsia="en-NZ"/>
+        </w:rPr>
+        <w:t xml:space="preserve">Populate MCU. Test its ability to be flashed. </w:t>
+      </w:r>
+    </w:p>
+    <w:p>
+      <w:pPr>
+        <w:rPr>
+          <w:lang w:eastAsia="en-NZ"/>
+        </w:rPr>
+      </w:pPr>
+    </w:p>
+    <w:p>
+      <w:pPr>
+        <w:rPr>
+          <w:lang w:eastAsia="en-NZ"/>
+        </w:rPr>
+      </w:pPr>
+      <w:r>
+        <w:rPr>
+          <w:lang w:eastAsia="en-NZ"/>
+        </w:rPr>
+        <w:t>Results</w:t>
+      </w:r>
+      <w:r>
+        <w:rPr>
+          <w:lang w:eastAsia="en-NZ"/>
+        </w:rPr>
+        <w:t>:</w:t>
+      </w:r>
+    </w:p>
+    <w:p>
+      <w:pPr>
+        <w:pStyle w:val="ListParagraph"/>
+        <w:numPr>
+          <w:ilvl w:val="0"/>
+          <w:numId w:val="3"/>
+        </w:numPr>
+        <w:rPr>
+          <w:lang w:eastAsia="en-NZ"/>
+        </w:rPr>
+      </w:pPr>
+      <w:r>
+        <w:rPr>
+          <w:lang w:eastAsia="en-NZ"/>
+        </w:rPr>
+        <w:t>PSU 5V/2mA: C78</w:t>
+      </w:r>
+      <w:r>
+        <w:rPr>
+          <w:lang w:eastAsia="en-NZ"/>
+        </w:rPr>
+        <w:t>: 4.993V</w:t>
+      </w:r>
+      <w:r>
+        <w:rPr>
+          <w:lang w:eastAsia="en-NZ"/>
+        </w:rPr>
+        <w:t>, C79</w:t>
+      </w:r>
+      <w:r>
+        <w:rPr>
+          <w:lang w:eastAsia="en-NZ"/>
+        </w:rPr>
+        <w:t>: 3.304V</w:t>
+      </w:r>
+    </w:p>
+    <w:p>
+      <w:pPr>
+        <w:pStyle w:val="ListParagraph"/>
+        <w:numPr>
+          <w:ilvl w:val="0"/>
+          <w:numId w:val="3"/>
+        </w:numPr>
+        <w:rPr>
+          <w:lang w:eastAsia="en-NZ"/>
+        </w:rPr>
+      </w:pPr>
+      <w:r>
+        <w:rPr>
+          <w:lang w:eastAsia="en-NZ"/>
+        </w:rPr>
+        <w:t>PSU 5V5/3mA: C78: 5.495, C79: 3.304V</w:t>
+      </w:r>
+    </w:p>
+    <w:p>
+      <w:pPr>
+        <w:pStyle w:val="ListParagraph"/>
+        <w:numPr>
+          <w:ilvl w:val="0"/>
+          <w:numId w:val="3"/>
+        </w:numPr>
+        <w:rPr>
+          <w:lang w:eastAsia="en-NZ"/>
+        </w:rPr>
+      </w:pPr>
+      <w:r>
+        <w:rPr>
+          <w:lang w:eastAsia="en-NZ"/>
+        </w:rPr>
+        <w:t>PSU 4V5/1mA: C78</w:t>
+      </w:r>
+      <w:proofErr w:type="gramStart"/>
+      <w:r>
+        <w:rPr>
+          <w:lang w:eastAsia="en-NZ"/>
+        </w:rPr>
+        <w:t>: ,</w:t>
+      </w:r>
+      <w:proofErr w:type="gramEnd"/>
+      <w:r>
+        <w:rPr>
+          <w:lang w:eastAsia="en-NZ"/>
+        </w:rPr>
+        <w:t xml:space="preserve"> C79: 4.495V, 3.304</w:t>
+      </w:r>
+      <w:r>
+        <w:rPr>
+          <w:lang w:eastAsia="en-NZ"/>
+        </w:rPr>
+        <w:t>V</w:t>
+      </w:r>
+    </w:p>
+    <w:p>
+      <w:pPr>
+        <w:rPr>
+          <w:lang w:eastAsia="en-NZ"/>
+        </w:rPr>
+      </w:pPr>
+    </w:p>
     <w:sectPr>
       <w:pgSz w:w="11906" w:h="16838"/>
       <w:pgMar w:top="1440" w:right="1440" w:bottom="1440" w:left="1440" w:header="708" w:footer="708" w:gutter="0"/>
@@ -17627,6 +17906,95 @@
     </w:lvl>
   </w:abstractNum>
   <w:abstractNum w:abstractNumId="4" w15:restartNumberingAfterBreak="0">
+    <w:nsid w:val="48727C0F"/>
+    <w:multiLevelType w:val="hybridMultilevel"/>
+    <w:tmpl w:val="9A1C9F96"/>
+    <w:lvl w:ilvl="0" w:tplc="1409000F">
+      <w:start w:val="1"/>
+      <w:numFmt w:val="decimal"/>
+      <w:lvlText w:val="%1."/>
+      <w:lvlJc w:val="left"/>
+      <w:pPr>
+        <w:ind w:left="720" w:hanging="360"/>
+      </w:pPr>
+      <w:rPr>
+        <w:rFonts w:hint="default"/>
+      </w:rPr>
+    </w:lvl>
+    <w:lvl w:ilvl="1" w:tplc="14090019" w:tentative="1">
+      <w:start w:val="1"/>
+      <w:numFmt w:val="lowerLetter"/>
+      <w:lvlText w:val="%2."/>
+      <w:lvlJc w:val="left"/>
+      <w:pPr>
+        <w:ind w:left="1440" w:hanging="360"/>
+      </w:pPr>
+    </w:lvl>
+    <w:lvl w:ilvl="2" w:tplc="1409001B" w:tentative="1">
+      <w:start w:val="1"/>
+      <w:numFmt w:val="lowerRoman"/>
+      <w:lvlText w:val="%3."/>
+      <w:lvlJc w:val="right"/>
+      <w:pPr>
+        <w:ind w:left="2160" w:hanging="180"/>
+      </w:pPr>
+    </w:lvl>
+    <w:lvl w:ilvl="3" w:tplc="1409000F" w:tentative="1">
+      <w:start w:val="1"/>
+      <w:numFmt w:val="decimal"/>
+      <w:lvlText w:val="%4."/>
+      <w:lvlJc w:val="left"/>
+      <w:pPr>
+        <w:ind w:left="2880" w:hanging="360"/>
+      </w:pPr>
+    </w:lvl>
+    <w:lvl w:ilvl="4" w:tplc="14090019" w:tentative="1">
+      <w:start w:val="1"/>
+      <w:numFmt w:val="lowerLetter"/>
+      <w:lvlText w:val="%5."/>
+      <w:lvlJc w:val="left"/>
+      <w:pPr>
+        <w:ind w:left="3600" w:hanging="360"/>
+      </w:pPr>
+    </w:lvl>
+    <w:lvl w:ilvl="5" w:tplc="1409001B" w:tentative="1">
+      <w:start w:val="1"/>
+      <w:numFmt w:val="lowerRoman"/>
+      <w:lvlText w:val="%6."/>
+      <w:lvlJc w:val="right"/>
+      <w:pPr>
+        <w:ind w:left="4320" w:hanging="180"/>
+      </w:pPr>
+    </w:lvl>
+    <w:lvl w:ilvl="6" w:tplc="1409000F" w:tentative="1">
+      <w:start w:val="1"/>
+      <w:numFmt w:val="decimal"/>
+      <w:lvlText w:val="%7."/>
+      <w:lvlJc w:val="left"/>
+      <w:pPr>
+        <w:ind w:left="5040" w:hanging="360"/>
+      </w:pPr>
+    </w:lvl>
+    <w:lvl w:ilvl="7" w:tplc="14090019" w:tentative="1">
+      <w:start w:val="1"/>
+      <w:numFmt w:val="lowerLetter"/>
+      <w:lvlText w:val="%8."/>
+      <w:lvlJc w:val="left"/>
+      <w:pPr>
+        <w:ind w:left="5760" w:hanging="360"/>
+      </w:pPr>
+    </w:lvl>
+    <w:lvl w:ilvl="8" w:tplc="1409001B" w:tentative="1">
+      <w:start w:val="1"/>
+      <w:numFmt w:val="lowerRoman"/>
+      <w:lvlText w:val="%9."/>
+      <w:lvlJc w:val="right"/>
+      <w:pPr>
+        <w:ind w:left="6480" w:hanging="180"/>
+      </w:pPr>
+    </w:lvl>
+  </w:abstractNum>
+  <w:abstractNum w:abstractNumId="5" w15:restartNumberingAfterBreak="0">
     <w:nsid w:val="7E886C42"/>
     <w:multiLevelType w:val="multilevel"/>
     <w:tmpl w:val="CDF85690"/>
@@ -17739,7 +18107,7 @@
       </w:rPr>
     </w:lvl>
   </w:abstractNum>
-  <w:abstractNum w:abstractNumId="5" w15:restartNumberingAfterBreak="0">
+  <w:abstractNum w:abstractNumId="6" w15:restartNumberingAfterBreak="0">
     <w:nsid w:val="7F5D54D9"/>
     <w:multiLevelType w:val="hybridMultilevel"/>
     <w:tmpl w:val="8A00B4D6"/>
@@ -17832,7 +18200,7 @@
     <w:abstractNumId w:val="0"/>
   </w:num>
   <w:num w:numId="2" w16cid:durableId="995185023">
-    <w:abstractNumId w:val="5"/>
+    <w:abstractNumId w:val="6"/>
   </w:num>
   <w:num w:numId="3" w16cid:durableId="190726118">
     <w:abstractNumId w:val="3"/>
@@ -17844,10 +18212,13 @@
     <w:abstractNumId w:val="2"/>
   </w:num>
   <w:num w:numId="5" w16cid:durableId="821969827">
-    <w:abstractNumId w:val="4"/>
+    <w:abstractNumId w:val="5"/>
   </w:num>
   <w:num w:numId="6" w16cid:durableId="74086557">
     <w:abstractNumId w:val="1"/>
+  </w:num>
+  <w:num w:numId="7" w16cid:durableId="609051963">
+    <w:abstractNumId w:val="4"/>
   </w:num>
 </w:numbering>
 </file>

</xml_diff>